<commit_message>
PowerBI Task 1 fixed
</commit_message>
<xml_diff>
--- a/PowerBI Task 1/PowerBILab1_Tutisani.docx
+++ b/PowerBI Task 1/PowerBILab1_Tutisani.docx
@@ -171,13 +171,8 @@
       </w:r>
       <w:proofErr w:type="spellEnd"/>
       <w:r>
-        <w:t xml:space="preserve"> column type was changed to Percentage. Screenshot shows values now displaying in percentage format (0,00%, 2,00%, 5,00%, etc.) with the Changed Type step visible in Applied </w:t>
-      </w:r>
-      <w:proofErr w:type="spellStart"/>
-      <w:r>
-        <w:t>Steps.</w:t>
-      </w:r>
-      <w:proofErr w:type="spellEnd"/>
+        <w:t xml:space="preserve"> column type was changed to Percentage. Screenshot shows values now displaying in percentage format (0,00%, 2,00%, 5,00%, etc.) with the Changed Type step visible in Applied Steps.</w:t>
+      </w:r>
     </w:p>
     <w:p>
       <w:r>
@@ -274,6 +269,9 @@
     </w:p>
     <w:p>
       <w:r>
+        <w:rPr>
+          <w:noProof/>
+        </w:rPr>
         <w:drawing>
           <wp:inline distT="0" distB="0" distL="0" distR="0" wp14:anchorId="7129C344" wp14:editId="6A350A27">
             <wp:extent cx="4391638" cy="4401164"/>
@@ -368,6 +366,9 @@
     </w:p>
     <w:p>
       <w:r>
+        <w:rPr>
+          <w:noProof/>
+        </w:rPr>
         <w:drawing>
           <wp:inline distT="0" distB="0" distL="0" distR="0" wp14:anchorId="39B0DF40" wp14:editId="45029B86">
             <wp:extent cx="5943600" cy="1823085"/>
@@ -407,6 +408,9 @@
     </w:p>
     <w:p>
       <w:r>
+        <w:rPr>
+          <w:noProof/>
+        </w:rPr>
         <w:drawing>
           <wp:inline distT="0" distB="0" distL="0" distR="0" wp14:anchorId="299F84A3" wp14:editId="206FFE87">
             <wp:extent cx="5943600" cy="1374140"/>
@@ -505,6 +509,9 @@
         <w:t xml:space="preserve"> </w:t>
       </w:r>
       <w:r>
+        <w:rPr>
+          <w:noProof/>
+        </w:rPr>
         <w:drawing>
           <wp:inline distT="0" distB="0" distL="0" distR="0" wp14:anchorId="14F64AFA" wp14:editId="3CB5E148">
             <wp:extent cx="5943600" cy="2081530"/>
@@ -570,6 +577,9 @@
     </w:p>
     <w:p>
       <w:r>
+        <w:rPr>
+          <w:noProof/>
+        </w:rPr>
         <w:drawing>
           <wp:inline distT="0" distB="0" distL="0" distR="0" wp14:anchorId="61E7E3FF" wp14:editId="43988934">
             <wp:extent cx="5943600" cy="1239520"/>
@@ -630,7 +640,15 @@
       </w:r>
       <w:proofErr w:type="spellEnd"/>
       <w:r>
-        <w:t xml:space="preserve"> was created the same way as in task 4.5, keeping only </w:t>
+        <w:t xml:space="preserve"> was created by referencing </w:t>
+      </w:r>
+      <w:proofErr w:type="spellStart"/>
+      <w:r>
+        <w:t>FactInternetSales</w:t>
+      </w:r>
+      <w:proofErr w:type="spellEnd"/>
+      <w:r>
+        <w:t xml:space="preserve">, keeping only four columns: </w:t>
       </w:r>
       <w:proofErr w:type="spellStart"/>
       <w:r>
@@ -654,12 +672,24 @@
       </w:r>
       <w:proofErr w:type="spellEnd"/>
       <w:r>
-        <w:t xml:space="preserve"> columns.</w:t>
-      </w:r>
-    </w:p>
-    <w:p>
-      <w:r>
-        <w:t xml:space="preserve">To join with </w:t>
+        <w:t>.</w:t>
+      </w:r>
+    </w:p>
+    <w:p>
+      <w:r>
+        <w:t>To enrich the data with territory and product category information, a multi-step table joining process was executed using Merge Queries with a Left Outer join type:</w:t>
+      </w:r>
+    </w:p>
+    <w:p>
+      <w:pPr>
+        <w:pStyle w:val="ListParagraph"/>
+        <w:numPr>
+          <w:ilvl w:val="0"/>
+          <w:numId w:val="2"/>
+        </w:numPr>
+      </w:pPr>
+      <w:r>
+        <w:t xml:space="preserve">Territory Join: Merged with </w:t>
       </w:r>
       <w:proofErr w:type="spellStart"/>
       <w:r>
@@ -667,7 +697,7 @@
       </w:r>
       <w:proofErr w:type="spellEnd"/>
       <w:r>
-        <w:t xml:space="preserve">, Merge Queries was used from the Home tab. </w:t>
+        <w:t xml:space="preserve"> using </w:t>
       </w:r>
       <w:proofErr w:type="spellStart"/>
       <w:r>
@@ -675,7 +705,7 @@
       </w:r>
       <w:proofErr w:type="spellEnd"/>
       <w:r>
-        <w:t xml:space="preserve"> was selected as the key column on both tables with Left Outer join type. After merging, the </w:t>
+        <w:t xml:space="preserve">, then expanded to include the </w:t>
       </w:r>
       <w:proofErr w:type="spellStart"/>
       <w:r>
@@ -683,12 +713,107 @@
       </w:r>
       <w:proofErr w:type="spellEnd"/>
       <w:r>
-        <w:t xml:space="preserve"> column was expanded from the joined result.</w:t>
-      </w:r>
-    </w:p>
-    <w:p>
-      <w:r>
-        <w:t xml:space="preserve">To get </w:t>
+        <w:t xml:space="preserve"> column.</w:t>
+      </w:r>
+    </w:p>
+    <w:p>
+      <w:pPr>
+        <w:pStyle w:val="ListParagraph"/>
+        <w:numPr>
+          <w:ilvl w:val="0"/>
+          <w:numId w:val="2"/>
+        </w:numPr>
+      </w:pPr>
+      <w:r>
+        <w:t xml:space="preserve">Product Subcategory Key Join: Merged with </w:t>
+      </w:r>
+      <w:proofErr w:type="spellStart"/>
+      <w:r>
+        <w:t>DimProduct</w:t>
+      </w:r>
+      <w:proofErr w:type="spellEnd"/>
+      <w:r>
+        <w:t xml:space="preserve"> using </w:t>
+      </w:r>
+      <w:proofErr w:type="spellStart"/>
+      <w:r>
+        <w:t>ProductKey</w:t>
+      </w:r>
+      <w:proofErr w:type="spellEnd"/>
+      <w:r>
+        <w:t xml:space="preserve">, expanding to retrieve </w:t>
+      </w:r>
+      <w:proofErr w:type="spellStart"/>
+      <w:r>
+        <w:t>ProductSubcategoryKey</w:t>
+      </w:r>
+      <w:proofErr w:type="spellEnd"/>
+      <w:r>
+        <w:t>.</w:t>
+      </w:r>
+    </w:p>
+    <w:p>
+      <w:pPr>
+        <w:pStyle w:val="ListParagraph"/>
+        <w:numPr>
+          <w:ilvl w:val="0"/>
+          <w:numId w:val="2"/>
+        </w:numPr>
+      </w:pPr>
+      <w:r>
+        <w:t xml:space="preserve">Product Category Key Join: Merged with </w:t>
+      </w:r>
+      <w:proofErr w:type="spellStart"/>
+      <w:r>
+        <w:t>DimProductSubcategory</w:t>
+      </w:r>
+      <w:proofErr w:type="spellEnd"/>
+      <w:r>
+        <w:t xml:space="preserve"> using </w:t>
+      </w:r>
+      <w:proofErr w:type="spellStart"/>
+      <w:r>
+        <w:t>ProductSubcategoryKey</w:t>
+      </w:r>
+      <w:proofErr w:type="spellEnd"/>
+      <w:r>
+        <w:t xml:space="preserve">, expanding to retrieve </w:t>
+      </w:r>
+      <w:proofErr w:type="spellStart"/>
+      <w:r>
+        <w:t>ProductCategoryKey</w:t>
+      </w:r>
+      <w:proofErr w:type="spellEnd"/>
+      <w:r>
+        <w:t>.</w:t>
+      </w:r>
+    </w:p>
+    <w:p>
+      <w:pPr>
+        <w:pStyle w:val="ListParagraph"/>
+        <w:numPr>
+          <w:ilvl w:val="0"/>
+          <w:numId w:val="2"/>
+        </w:numPr>
+      </w:pPr>
+      <w:r>
+        <w:t xml:space="preserve">Product Category Name Join: Merged with </w:t>
+      </w:r>
+      <w:proofErr w:type="spellStart"/>
+      <w:r>
+        <w:t>DimProductCategory</w:t>
+      </w:r>
+      <w:proofErr w:type="spellEnd"/>
+      <w:r>
+        <w:t xml:space="preserve"> using </w:t>
+      </w:r>
+      <w:proofErr w:type="spellStart"/>
+      <w:r>
+        <w:t>ProductCategoryKey</w:t>
+      </w:r>
+      <w:proofErr w:type="spellEnd"/>
+      <w:r>
+        <w:t xml:space="preserve">, expanding to extract the final </w:t>
       </w:r>
       <w:proofErr w:type="spellStart"/>
       <w:r>
@@ -696,51 +821,40 @@
       </w:r>
       <w:proofErr w:type="spellEnd"/>
       <w:r>
-        <w:t xml:space="preserve">, two additional merges were needed since the category name isn't directly accessible from </w:t>
-      </w:r>
-      <w:proofErr w:type="spellStart"/>
-      <w:r>
-        <w:t>ProductKey</w:t>
-      </w:r>
-      <w:proofErr w:type="spellEnd"/>
-      <w:r>
-        <w:t>,</w:t>
-      </w:r>
-      <w:r>
-        <w:t xml:space="preserve"> it required going through </w:t>
-      </w:r>
-      <w:proofErr w:type="spellStart"/>
-      <w:r>
-        <w:t>DimProductSubcategory</w:t>
-      </w:r>
-      <w:proofErr w:type="spellEnd"/>
-      <w:r>
-        <w:t xml:space="preserve"> first, then </w:t>
-      </w:r>
-      <w:proofErr w:type="spellStart"/>
-      <w:r>
-        <w:t>DimProductCategory</w:t>
-      </w:r>
-      <w:proofErr w:type="spellEnd"/>
-      <w:r>
-        <w:t>, hence the three table joins mentioned in the hint.</w:t>
-      </w:r>
-    </w:p>
-    <w:p>
-      <w:r>
-        <w:t xml:space="preserve">Screenshot </w:t>
-      </w:r>
-      <w:r>
-        <w:t xml:space="preserve">below </w:t>
-      </w:r>
-      <w:r>
-        <w:t>shows the final table with all columns populated correctly, and the Applied Steps panel on the right confirms all merge and expand steps were completed successfully.</w:t>
-      </w:r>
-      <w:r>
+        <w:t>.</w:t>
+      </w:r>
+    </w:p>
+    <w:p>
+      <w:r>
+        <w:t xml:space="preserve">The Applied Steps panel confirms all merge and </w:t>
+      </w:r>
+      <w:proofErr w:type="gramStart"/>
+      <w:r>
+        <w:t>expand</w:t>
+      </w:r>
+      <w:proofErr w:type="gramEnd"/>
+      <w:r>
+        <w:t xml:space="preserve"> operations </w:t>
+      </w:r>
+      <w:proofErr w:type="gramStart"/>
+      <w:r>
+        <w:t>completed</w:t>
+      </w:r>
+      <w:proofErr w:type="gramEnd"/>
+      <w:r>
+        <w:t xml:space="preserve"> successfully</w:t>
+      </w:r>
+      <w:r>
+        <w:t>.</w:t>
+      </w:r>
+      <w:r>
+        <w:rPr>
+          <w:noProof/>
+        </w:rPr>
         <w:drawing>
-          <wp:inline distT="0" distB="0" distL="0" distR="0" wp14:anchorId="0A7B4D1F" wp14:editId="2DBDF992">
-            <wp:extent cx="5943600" cy="2682240"/>
-            <wp:effectExtent l="0" t="0" r="0" b="3810"/>
+          <wp:inline distT="0" distB="0" distL="0" distR="0" wp14:anchorId="0A7B4D1F" wp14:editId="509A8230">
+            <wp:extent cx="5943600" cy="1893691"/>
+            <wp:effectExtent l="0" t="0" r="0" b="0"/>
             <wp:docPr id="1635770547" name="Picture 1"/>
             <wp:cNvGraphicFramePr>
               <a:graphicFrameLocks xmlns:a="http://schemas.openxmlformats.org/drawingml/2006/main" noChangeAspect="1"/>
@@ -749,11 +863,17 @@
               <a:graphicData uri="http://schemas.openxmlformats.org/drawingml/2006/picture">
                 <pic:pic xmlns:pic="http://schemas.openxmlformats.org/drawingml/2006/picture">
                   <pic:nvPicPr>
-                    <pic:cNvPr id="1635770547" name=""/>
+                    <pic:cNvPr id="1635770547" name="Picture 1"/>
                     <pic:cNvPicPr/>
                   </pic:nvPicPr>
                   <pic:blipFill>
-                    <a:blip r:embed="rId12"/>
+                    <a:blip r:embed="rId12" cstate="print">
+                      <a:extLst>
+                        <a:ext uri="{28A0092B-C50C-407E-A947-70E740481C1C}">
+                          <a14:useLocalDpi xmlns:a14="http://schemas.microsoft.com/office/drawing/2010/main" val="0"/>
+                        </a:ext>
+                      </a:extLst>
+                    </a:blip>
                     <a:stretch>
                       <a:fillRect/>
                     </a:stretch>
@@ -761,7 +881,7 @@
                   <pic:spPr>
                     <a:xfrm>
                       <a:off x="0" y="0"/>
-                      <a:ext cx="5943600" cy="2682240"/>
+                      <a:ext cx="5943600" cy="1893691"/>
                     </a:xfrm>
                     <a:prstGeom prst="rect">
                       <a:avLst/>
@@ -785,7 +905,7 @@
     </w:p>
     <w:p>
       <w:r>
-        <w:t xml:space="preserve">Group By was opened from the Transform tab. Advanced mode was selected to allow multiple grouping columns. Order Year, </w:t>
+        <w:t xml:space="preserve">The Group By feature was opened from the Transform tab using Advanced mode to aggregate multiple columns. Order Year, </w:t>
       </w:r>
       <w:proofErr w:type="spellStart"/>
       <w:r>
@@ -801,7 +921,7 @@
       </w:r>
       <w:proofErr w:type="spellEnd"/>
       <w:r>
-        <w:t xml:space="preserve"> were added as grouping columns, and Sales was set as the new aggregated column using Sum on </w:t>
+        <w:t xml:space="preserve"> were set as the grouping columns. A new column named Sales was created using the Sum operation on the </w:t>
       </w:r>
       <w:proofErr w:type="spellStart"/>
       <w:r>
@@ -809,25 +929,27 @@
       </w:r>
       <w:proofErr w:type="spellEnd"/>
       <w:r>
-        <w:t>. The table was then sorted by Order Year.</w:t>
-      </w:r>
-    </w:p>
-    <w:p>
-      <w:r>
-        <w:t>Screenshot shows the result</w:t>
-      </w:r>
-      <w:r>
-        <w:t>. T</w:t>
-      </w:r>
-      <w:r>
-        <w:t>he data is now summarized by year, country, and product category, making it much easier to analyze sales trends. For example Germany / Road Bikes / 2012 totals 430,698.46. The Grouped Rows step is visible in Applied Steps confirming the operation.</w:t>
-      </w:r>
+        <w:t xml:space="preserve"> column. Finally, the table was sorted ascending by Order Year.</w:t>
+      </w:r>
+    </w:p>
+    <w:p>
+      <w:r>
+        <w:t>The resulting table effectively summarizes sales performance by year, country, and product category</w:t>
+      </w:r>
+      <w:r>
+        <w:t xml:space="preserve">. </w:t>
+      </w:r>
+      <w:r>
+        <w:t>The Grouped Rows step is visible in the Applied Steps panel.</w:t>
+      </w:r>
+    </w:p>
+    <w:p>
       <w:r>
         <w:drawing>
-          <wp:inline distT="0" distB="0" distL="0" distR="0" wp14:anchorId="7AC03846" wp14:editId="1BC938F9">
-            <wp:extent cx="5943600" cy="1902460"/>
+          <wp:inline distT="0" distB="0" distL="0" distR="0" wp14:anchorId="3A7A713F" wp14:editId="399129BF">
+            <wp:extent cx="5943600" cy="3293110"/>
             <wp:effectExtent l="0" t="0" r="0" b="2540"/>
-            <wp:docPr id="1891120844" name="Picture 1"/>
+            <wp:docPr id="1070792839" name="Picture 1"/>
             <wp:cNvGraphicFramePr>
               <a:graphicFrameLocks xmlns:a="http://schemas.openxmlformats.org/drawingml/2006/main" noChangeAspect="1"/>
             </wp:cNvGraphicFramePr>
@@ -835,7 +957,7 @@
               <a:graphicData uri="http://schemas.openxmlformats.org/drawingml/2006/picture">
                 <pic:pic xmlns:pic="http://schemas.openxmlformats.org/drawingml/2006/picture">
                   <pic:nvPicPr>
-                    <pic:cNvPr id="1891120844" name=""/>
+                    <pic:cNvPr id="1070792839" name=""/>
                     <pic:cNvPicPr/>
                   </pic:nvPicPr>
                   <pic:blipFill>
@@ -847,7 +969,7 @@
                   <pic:spPr>
                     <a:xfrm>
                       <a:off x="0" y="0"/>
-                      <a:ext cx="5943600" cy="1902460"/>
+                      <a:ext cx="5943600" cy="3293110"/>
                     </a:xfrm>
                     <a:prstGeom prst="rect">
                       <a:avLst/>
@@ -858,6 +980,73 @@
             </a:graphic>
           </wp:inline>
         </w:drawing>
+      </w:r>
+    </w:p>
+    <w:p>
+      <w:r>
+        <w:t xml:space="preserve">4.9 Import vs. </w:t>
+      </w:r>
+      <w:proofErr w:type="spellStart"/>
+      <w:r>
+        <w:t>DirectQuery</w:t>
+      </w:r>
+      <w:proofErr w:type="spellEnd"/>
+    </w:p>
+    <w:p>
+      <w:r>
+        <w:t xml:space="preserve">Import mode loads a full copy of the data from the source into Power BI's internal memory when you click "Close &amp; Apply". All report visuals then query this </w:t>
+      </w:r>
+      <w:proofErr w:type="gramStart"/>
+      <w:r>
+        <w:t>cached</w:t>
+      </w:r>
+      <w:proofErr w:type="gramEnd"/>
+      <w:r>
+        <w:t xml:space="preserve"> copy, which makes interactions fast. The downside is that the data doesn't update automatically</w:t>
+      </w:r>
+      <w:r>
+        <w:t>,</w:t>
+      </w:r>
+      <w:r>
+        <w:t xml:space="preserve"> you have to manually refresh or schedule a refresh to pick up changes from the source. This mode works best when the dataset is reasonably sized and doesn't need to be real-time.</w:t>
+      </w:r>
+    </w:p>
+    <w:p>
+      <w:proofErr w:type="spellStart"/>
+      <w:r>
+        <w:t>DirectQuery</w:t>
+      </w:r>
+      <w:proofErr w:type="spellEnd"/>
+      <w:r>
+        <w:t xml:space="preserve"> mode doesn't copy any data. Instead, every time you interact with a visual, Power BI sends a live query to the source database and returns the result. This means the data is always current, but it also means performance depends entirely on how fast the database responds. If the source is slow, the report will feel slow. </w:t>
+      </w:r>
+      <w:proofErr w:type="spellStart"/>
+      <w:r>
+        <w:t>DirectQuery</w:t>
+      </w:r>
+      <w:proofErr w:type="spellEnd"/>
+      <w:r>
+        <w:t xml:space="preserve"> also has limitations</w:t>
+      </w:r>
+      <w:r>
+        <w:t>,</w:t>
+      </w:r>
+      <w:r>
+        <w:t xml:space="preserve"> some Power BI features like certain DAX functions and calculated columns aren't available.</w:t>
+      </w:r>
+    </w:p>
+    <w:p/>
+    <w:p>
+      <w:r>
+        <w:t xml:space="preserve">In practice, Import is the better choice for most reports. </w:t>
+      </w:r>
+      <w:proofErr w:type="spellStart"/>
+      <w:r>
+        <w:t>DirectQuery</w:t>
+      </w:r>
+      <w:proofErr w:type="spellEnd"/>
+      <w:r>
+        <w:t xml:space="preserve"> is useful when the data changes constantly and you need real-time accuracy, or when the dataset is too large to import.</w:t>
       </w:r>
     </w:p>
     <w:sectPr>
@@ -873,6 +1062,119 @@
 <file path=word/numbering.xml><?xml version="1.0" encoding="utf-8"?>
 <w:numbering xmlns:wpc="http://schemas.microsoft.com/office/word/2010/wordprocessingCanvas" xmlns:cx="http://schemas.microsoft.com/office/drawing/2014/chartex" xmlns:cx1="http://schemas.microsoft.com/office/drawing/2015/9/8/chartex" xmlns:cx2="http://schemas.microsoft.com/office/drawing/2015/10/21/chartex" xmlns:cx3="http://schemas.microsoft.com/office/drawing/2016/5/9/chartex" xmlns:cx4="http://schemas.microsoft.com/office/drawing/2016/5/10/chartex" xmlns:cx5="http://schemas.microsoft.com/office/drawing/2016/5/11/chartex" xmlns:cx6="http://schemas.microsoft.com/office/drawing/2016/5/12/chartex" xmlns:cx7="http://schemas.microsoft.com/office/drawing/2016/5/13/chartex" xmlns:cx8="http://schemas.microsoft.com/office/drawing/2016/5/14/chartex" xmlns:mc="http://schemas.openxmlformats.org/markup-compatibility/2006" xmlns:aink="http://schemas.microsoft.com/office/drawing/2016/ink" xmlns:am3d="http://schemas.microsoft.com/office/drawing/2017/model3d" xmlns:o="urn:schemas-microsoft-com:office:office" xmlns:oel="http://schemas.microsoft.com/office/2019/extlst" xmlns:r="http://schemas.openxmlformats.org/officeDocument/2006/relationships" xmlns:m="http://schemas.openxmlformats.org/officeDocument/2006/math" xmlns:v="urn:schemas-microsoft-com:vml" xmlns:wp14="http://schemas.microsoft.com/office/word/2010/wordprocessingDrawing" xmlns:wp="http://schemas.openxmlformats.org/drawingml/2006/wordprocessingDrawing" xmlns:w10="urn:schemas-microsoft-com:office:word" xmlns:w="http://schemas.openxmlformats.org/wordprocessingml/2006/main" xmlns:w14="http://schemas.microsoft.com/office/word/2010/wordml" xmlns:w15="http://schemas.microsoft.com/office/word/2012/wordml" xmlns:w16cei="http://schemas.microsoft.com/office/word/2026/wordml/cei" xmlns:w16cex="http://schemas.microsoft.com/office/word/2018/wordml/cex" xmlns:w16cid="http://schemas.microsoft.com/office/word/2016/wordml/cid" xmlns:w16="http://schemas.microsoft.com/office/word/2018/wordml" xmlns:w16du="http://schemas.microsoft.com/office/word/2023/wordml/word16du" xmlns:w16sdtdh="http://schemas.microsoft.com/office/word/2020/wordml/sdtdatahash" xmlns:w16sdtfl="http://schemas.microsoft.com/office/word/2024/wordml/sdtformatlock" xmlns:w16se="http://schemas.microsoft.com/office/word/2015/wordml/symex" xmlns:wpg="http://schemas.microsoft.com/office/word/2010/wordprocessingGroup" xmlns:wpi="http://schemas.microsoft.com/office/word/2010/wordprocessingInk" xmlns:wne="http://schemas.microsoft.com/office/word/2006/wordml" xmlns:wps="http://schemas.microsoft.com/office/word/2010/wordprocessingShape" mc:Ignorable="w14 w15 w16se w16cid w16 w16cex w16sdtdh w16sdtfl w16du wp14">
   <w:abstractNum w:abstractNumId="0" w15:restartNumberingAfterBreak="0">
+    <w:nsid w:val="55F26780"/>
+    <w:multiLevelType w:val="hybridMultilevel"/>
+    <w:tmpl w:val="A72EFFEE"/>
+    <w:lvl w:ilvl="0" w:tplc="04090001">
+      <w:start w:val="1"/>
+      <w:numFmt w:val="bullet"/>
+      <w:lvlText w:val=""/>
+      <w:lvlJc w:val="left"/>
+      <w:pPr>
+        <w:ind w:left="720" w:hanging="360"/>
+      </w:pPr>
+      <w:rPr>
+        <w:rFonts w:ascii="Symbol" w:hAnsi="Symbol" w:hint="default"/>
+      </w:rPr>
+    </w:lvl>
+    <w:lvl w:ilvl="1" w:tplc="04090003" w:tentative="1">
+      <w:start w:val="1"/>
+      <w:numFmt w:val="bullet"/>
+      <w:lvlText w:val="o"/>
+      <w:lvlJc w:val="left"/>
+      <w:pPr>
+        <w:ind w:left="1440" w:hanging="360"/>
+      </w:pPr>
+      <w:rPr>
+        <w:rFonts w:ascii="Courier New" w:hAnsi="Courier New" w:cs="Courier New" w:hint="default"/>
+      </w:rPr>
+    </w:lvl>
+    <w:lvl w:ilvl="2" w:tplc="04090005" w:tentative="1">
+      <w:start w:val="1"/>
+      <w:numFmt w:val="bullet"/>
+      <w:lvlText w:val=""/>
+      <w:lvlJc w:val="left"/>
+      <w:pPr>
+        <w:ind w:left="2160" w:hanging="360"/>
+      </w:pPr>
+      <w:rPr>
+        <w:rFonts w:ascii="Wingdings" w:hAnsi="Wingdings" w:hint="default"/>
+      </w:rPr>
+    </w:lvl>
+    <w:lvl w:ilvl="3" w:tplc="04090001" w:tentative="1">
+      <w:start w:val="1"/>
+      <w:numFmt w:val="bullet"/>
+      <w:lvlText w:val=""/>
+      <w:lvlJc w:val="left"/>
+      <w:pPr>
+        <w:ind w:left="2880" w:hanging="360"/>
+      </w:pPr>
+      <w:rPr>
+        <w:rFonts w:ascii="Symbol" w:hAnsi="Symbol" w:hint="default"/>
+      </w:rPr>
+    </w:lvl>
+    <w:lvl w:ilvl="4" w:tplc="04090003" w:tentative="1">
+      <w:start w:val="1"/>
+      <w:numFmt w:val="bullet"/>
+      <w:lvlText w:val="o"/>
+      <w:lvlJc w:val="left"/>
+      <w:pPr>
+        <w:ind w:left="3600" w:hanging="360"/>
+      </w:pPr>
+      <w:rPr>
+        <w:rFonts w:ascii="Courier New" w:hAnsi="Courier New" w:cs="Courier New" w:hint="default"/>
+      </w:rPr>
+    </w:lvl>
+    <w:lvl w:ilvl="5" w:tplc="04090005" w:tentative="1">
+      <w:start w:val="1"/>
+      <w:numFmt w:val="bullet"/>
+      <w:lvlText w:val=""/>
+      <w:lvlJc w:val="left"/>
+      <w:pPr>
+        <w:ind w:left="4320" w:hanging="360"/>
+      </w:pPr>
+      <w:rPr>
+        <w:rFonts w:ascii="Wingdings" w:hAnsi="Wingdings" w:hint="default"/>
+      </w:rPr>
+    </w:lvl>
+    <w:lvl w:ilvl="6" w:tplc="04090001" w:tentative="1">
+      <w:start w:val="1"/>
+      <w:numFmt w:val="bullet"/>
+      <w:lvlText w:val=""/>
+      <w:lvlJc w:val="left"/>
+      <w:pPr>
+        <w:ind w:left="5040" w:hanging="360"/>
+      </w:pPr>
+      <w:rPr>
+        <w:rFonts w:ascii="Symbol" w:hAnsi="Symbol" w:hint="default"/>
+      </w:rPr>
+    </w:lvl>
+    <w:lvl w:ilvl="7" w:tplc="04090003" w:tentative="1">
+      <w:start w:val="1"/>
+      <w:numFmt w:val="bullet"/>
+      <w:lvlText w:val="o"/>
+      <w:lvlJc w:val="left"/>
+      <w:pPr>
+        <w:ind w:left="5760" w:hanging="360"/>
+      </w:pPr>
+      <w:rPr>
+        <w:rFonts w:ascii="Courier New" w:hAnsi="Courier New" w:cs="Courier New" w:hint="default"/>
+      </w:rPr>
+    </w:lvl>
+    <w:lvl w:ilvl="8" w:tplc="04090005" w:tentative="1">
+      <w:start w:val="1"/>
+      <w:numFmt w:val="bullet"/>
+      <w:lvlText w:val=""/>
+      <w:lvlJc w:val="left"/>
+      <w:pPr>
+        <w:ind w:left="6480" w:hanging="360"/>
+      </w:pPr>
+      <w:rPr>
+        <w:rFonts w:ascii="Wingdings" w:hAnsi="Wingdings" w:hint="default"/>
+      </w:rPr>
+    </w:lvl>
+  </w:abstractNum>
+  <w:abstractNum w:abstractNumId="1" w15:restartNumberingAfterBreak="0">
     <w:nsid w:val="6F6374AB"/>
     <w:multiLevelType w:val="multilevel"/>
     <w:tmpl w:val="69E26A94"/>
@@ -993,6 +1295,9 @@
     </w:lvl>
   </w:abstractNum>
   <w:num w:numId="1" w16cid:durableId="1181746532">
+    <w:abstractNumId w:val="1"/>
+  </w:num>
+  <w:num w:numId="2" w16cid:durableId="1051460256">
     <w:abstractNumId w:val="0"/>
   </w:num>
 </w:numbering>

</xml_diff>